<commit_message>
Atualização do trabalho com correções e melhorias
</commit_message>
<xml_diff>
--- a/Machine learning & Chatbot.docx
+++ b/Machine learning & Chatbot.docx
@@ -186,6 +186,7 @@
           <w:t xml:space="preserve">Machine Learning &amp; </w:t>
         </w:r>
       </w:hyperlink>
+      <w:proofErr w:type="spellStart"/>
       <w:r>
         <w:rPr>
           <w:rFonts w:ascii="Arial" w:hAnsi="Arial" w:cs="Arial"/>
@@ -200,6 +201,7 @@
         </w:rPr>
         <w:t>ot</w:t>
       </w:r>
+      <w:proofErr w:type="spellEnd"/>
       <w:r>
         <w:rPr>
           <w:rFonts w:ascii="Arial" w:hAnsi="Arial" w:cs="Arial"/>
@@ -579,6 +581,7 @@
           <w:t xml:space="preserve">Machine Learning &amp; </w:t>
         </w:r>
       </w:hyperlink>
+      <w:proofErr w:type="spellStart"/>
       <w:r>
         <w:rPr>
           <w:rFonts w:ascii="Arial" w:hAnsi="Arial" w:cs="Arial"/>
@@ -588,6 +591,7 @@
         </w:rPr>
         <w:t>ChatBot</w:t>
       </w:r>
+      <w:proofErr w:type="spellEnd"/>
       <w:r>
         <w:rPr>
           <w:rFonts w:ascii="Arial" w:hAnsi="Arial" w:cs="Arial"/>
@@ -604,7 +608,21 @@
         <w:rPr>
           <w:rFonts w:ascii="Arial" w:hAnsi="Arial" w:cs="Arial"/>
         </w:rPr>
-        <w:t xml:space="preserve"> do Centro Universitário UniFECAF. </w:t>
+        <w:t xml:space="preserve"> do Centro Universitário </w:t>
+      </w:r>
+      <w:proofErr w:type="spellStart"/>
+      <w:r>
+        <w:rPr>
+          <w:rFonts w:ascii="Arial" w:hAnsi="Arial" w:cs="Arial"/>
+        </w:rPr>
+        <w:t>UniFECAF</w:t>
+      </w:r>
+      <w:proofErr w:type="spellEnd"/>
+      <w:r>
+        <w:rPr>
+          <w:rFonts w:ascii="Arial" w:hAnsi="Arial" w:cs="Arial"/>
+        </w:rPr>
+        <w:t xml:space="preserve">. </w:t>
       </w:r>
     </w:p>
     <w:p>
@@ -905,7 +923,7 @@
             </w:rPr>
             <w:fldChar w:fldCharType="separate"/>
           </w:r>
-          <w:hyperlink w:anchor="_Toc224323548" w:history="1">
+          <w:hyperlink w:anchor="_Toc224912204" w:history="1">
             <w:r>
               <w:rPr>
                 <w:rStyle w:val="Hyperlink"/>
@@ -946,7 +964,7 @@
               <w:rPr>
                 <w:webHidden/>
               </w:rPr>
-              <w:instrText xml:space="preserve"> PAGEREF _Toc224323548 \h </w:instrText>
+              <w:instrText xml:space="preserve"> PAGEREF _Toc224912204 \h </w:instrText>
             </w:r>
             <w:r>
               <w:rPr>
@@ -984,7 +1002,7 @@
               <w14:ligatures w14:val="standardContextual"/>
             </w:rPr>
           </w:pPr>
-          <w:hyperlink w:anchor="_Toc224323549" w:history="1">
+          <w:hyperlink w:anchor="_Toc224912205" w:history="1">
             <w:r>
               <w:rPr>
                 <w:rStyle w:val="Hyperlink"/>
@@ -1025,7 +1043,7 @@
               <w:rPr>
                 <w:webHidden/>
               </w:rPr>
-              <w:instrText xml:space="preserve"> PAGEREF _Toc224323549 \h </w:instrText>
+              <w:instrText xml:space="preserve"> PAGEREF _Toc224912205 \h </w:instrText>
             </w:r>
             <w:r>
               <w:rPr>
@@ -1063,7 +1081,7 @@
               <w14:ligatures w14:val="standardContextual"/>
             </w:rPr>
           </w:pPr>
-          <w:hyperlink w:anchor="_Toc224323550" w:history="1">
+          <w:hyperlink w:anchor="_Toc224912206" w:history="1">
             <w:r>
               <w:rPr>
                 <w:rStyle w:val="Hyperlink"/>
@@ -1106,7 +1124,7 @@
               <w:rPr>
                 <w:webHidden/>
               </w:rPr>
-              <w:instrText xml:space="preserve"> PAGEREF _Toc224323550 \h </w:instrText>
+              <w:instrText xml:space="preserve"> PAGEREF _Toc224912206 \h </w:instrText>
             </w:r>
             <w:r>
               <w:rPr>
@@ -1144,7 +1162,7 @@
               <w14:ligatures w14:val="standardContextual"/>
             </w:rPr>
           </w:pPr>
-          <w:hyperlink w:anchor="_Toc224323551" w:history="1">
+          <w:hyperlink w:anchor="_Toc224912207" w:history="1">
             <w:r>
               <w:rPr>
                 <w:rStyle w:val="Hyperlink"/>
@@ -1183,7 +1201,7 @@
               <w:rPr>
                 <w:webHidden/>
               </w:rPr>
-              <w:instrText xml:space="preserve"> PAGEREF _Toc224323551 \h </w:instrText>
+              <w:instrText xml:space="preserve"> PAGEREF _Toc224912207 \h </w:instrText>
             </w:r>
             <w:r>
               <w:rPr>
@@ -1221,7 +1239,7 @@
               <w14:ligatures w14:val="standardContextual"/>
             </w:rPr>
           </w:pPr>
-          <w:hyperlink w:anchor="_Toc224323552" w:history="1">
+          <w:hyperlink w:anchor="_Toc224912208" w:history="1">
             <w:r>
               <w:rPr>
                 <w:rStyle w:val="Hyperlink"/>
@@ -1260,7 +1278,7 @@
               <w:rPr>
                 <w:webHidden/>
               </w:rPr>
-              <w:instrText xml:space="preserve"> PAGEREF _Toc224323552 \h </w:instrText>
+              <w:instrText xml:space="preserve"> PAGEREF _Toc224912208 \h </w:instrText>
             </w:r>
             <w:r>
               <w:rPr>
@@ -1298,7 +1316,7 @@
               <w14:ligatures w14:val="standardContextual"/>
             </w:rPr>
           </w:pPr>
-          <w:hyperlink w:anchor="_Toc224323553" w:history="1">
+          <w:hyperlink w:anchor="_Toc224912209" w:history="1">
             <w:r>
               <w:rPr>
                 <w:rStyle w:val="Hyperlink"/>
@@ -1337,7 +1355,7 @@
               <w:rPr>
                 <w:webHidden/>
               </w:rPr>
-              <w:instrText xml:space="preserve"> PAGEREF _Toc224323553 \h </w:instrText>
+              <w:instrText xml:space="preserve"> PAGEREF _Toc224912209 \h </w:instrText>
             </w:r>
             <w:r>
               <w:rPr>
@@ -1375,7 +1393,7 @@
               <w14:ligatures w14:val="standardContextual"/>
             </w:rPr>
           </w:pPr>
-          <w:hyperlink w:anchor="_Toc224323554" w:history="1">
+          <w:hyperlink w:anchor="_Toc224912210" w:history="1">
             <w:r>
               <w:rPr>
                 <w:rStyle w:val="Hyperlink"/>
@@ -1414,7 +1432,7 @@
               <w:rPr>
                 <w:webHidden/>
               </w:rPr>
-              <w:instrText xml:space="preserve"> PAGEREF _Toc224323554 \h </w:instrText>
+              <w:instrText xml:space="preserve"> PAGEREF _Toc224912210 \h </w:instrText>
             </w:r>
             <w:r>
               <w:rPr>
@@ -1452,7 +1470,7 @@
               <w14:ligatures w14:val="standardContextual"/>
             </w:rPr>
           </w:pPr>
-          <w:hyperlink w:anchor="_Toc224323555" w:history="1">
+          <w:hyperlink w:anchor="_Toc224912211" w:history="1">
             <w:r>
               <w:rPr>
                 <w:rStyle w:val="Hyperlink"/>
@@ -1491,7 +1509,7 @@
               <w:rPr>
                 <w:webHidden/>
               </w:rPr>
-              <w:instrText xml:space="preserve"> PAGEREF _Toc224323555 \h </w:instrText>
+              <w:instrText xml:space="preserve"> PAGEREF _Toc224912211 \h </w:instrText>
             </w:r>
             <w:r>
               <w:rPr>
@@ -1529,7 +1547,7 @@
               <w14:ligatures w14:val="standardContextual"/>
             </w:rPr>
           </w:pPr>
-          <w:hyperlink w:anchor="_Toc224323556" w:history="1">
+          <w:hyperlink w:anchor="_Toc224912212" w:history="1">
             <w:r>
               <w:rPr>
                 <w:rStyle w:val="Hyperlink"/>
@@ -1568,7 +1586,7 @@
               <w:rPr>
                 <w:webHidden/>
               </w:rPr>
-              <w:instrText xml:space="preserve"> PAGEREF _Toc224323556 \h </w:instrText>
+              <w:instrText xml:space="preserve"> PAGEREF _Toc224912212 \h </w:instrText>
             </w:r>
             <w:r>
               <w:rPr>
@@ -1609,7 +1627,7 @@
               <w14:ligatures w14:val="standardContextual"/>
             </w:rPr>
           </w:pPr>
-          <w:hyperlink w:anchor="_Toc224323557" w:history="1">
+          <w:hyperlink w:anchor="_Toc224912213" w:history="1">
             <w:r>
               <w:rPr>
                 <w:rStyle w:val="Hyperlink"/>
@@ -1648,7 +1666,7 @@
               <w:rPr>
                 <w:webHidden/>
               </w:rPr>
-              <w:instrText xml:space="preserve"> PAGEREF _Toc224323557 \h </w:instrText>
+              <w:instrText xml:space="preserve"> PAGEREF _Toc224912213 \h </w:instrText>
             </w:r>
             <w:r>
               <w:rPr>
@@ -1689,7 +1707,7 @@
               <w14:ligatures w14:val="standardContextual"/>
             </w:rPr>
           </w:pPr>
-          <w:hyperlink w:anchor="_Toc224323558" w:history="1">
+          <w:hyperlink w:anchor="_Toc224912214" w:history="1">
             <w:r>
               <w:rPr>
                 <w:rStyle w:val="Hyperlink"/>
@@ -1728,7 +1746,7 @@
               <w:rPr>
                 <w:webHidden/>
               </w:rPr>
-              <w:instrText xml:space="preserve"> PAGEREF _Toc224323558 \h </w:instrText>
+              <w:instrText xml:space="preserve"> PAGEREF _Toc224912214 \h </w:instrText>
             </w:r>
             <w:r>
               <w:rPr>
@@ -1769,7 +1787,7 @@
               <w14:ligatures w14:val="standardContextual"/>
             </w:rPr>
           </w:pPr>
-          <w:hyperlink w:anchor="_Toc224323559" w:history="1">
+          <w:hyperlink w:anchor="_Toc224912215" w:history="1">
             <w:r>
               <w:rPr>
                 <w:rStyle w:val="Hyperlink"/>
@@ -1808,7 +1826,7 @@
               <w:rPr>
                 <w:webHidden/>
               </w:rPr>
-              <w:instrText xml:space="preserve"> PAGEREF _Toc224323559 \h </w:instrText>
+              <w:instrText xml:space="preserve"> PAGEREF _Toc224912215 \h </w:instrText>
             </w:r>
             <w:r>
               <w:rPr>
@@ -1849,7 +1867,7 @@
               <w14:ligatures w14:val="standardContextual"/>
             </w:rPr>
           </w:pPr>
-          <w:hyperlink w:anchor="_Toc224323560" w:history="1">
+          <w:hyperlink w:anchor="_Toc224912216" w:history="1">
             <w:r>
               <w:rPr>
                 <w:rStyle w:val="Hyperlink"/>
@@ -1888,7 +1906,7 @@
               <w:rPr>
                 <w:webHidden/>
               </w:rPr>
-              <w:instrText xml:space="preserve"> PAGEREF _Toc224323560 \h </w:instrText>
+              <w:instrText xml:space="preserve"> PAGEREF _Toc224912216 \h </w:instrText>
             </w:r>
             <w:r>
               <w:rPr>
@@ -1906,6 +1924,86 @@
                 <w:webHidden/>
               </w:rPr>
               <w:t>12</w:t>
+            </w:r>
+            <w:r>
+              <w:rPr>
+                <w:webHidden/>
+              </w:rPr>
+              <w:fldChar w:fldCharType="end"/>
+            </w:r>
+          </w:hyperlink>
+        </w:p>
+        <w:p>
+          <w:pPr>
+            <w:pStyle w:val="Sumrio1"/>
+            <w:tabs>
+              <w:tab w:val="left" w:pos="1440"/>
+            </w:tabs>
+            <w:rPr>
+              <w:rFonts w:asciiTheme="minorHAnsi" w:eastAsiaTheme="minorEastAsia" w:hAnsiTheme="minorHAnsi" w:cstheme="minorBidi"/>
+              <w:b w:val="0"/>
+              <w:caps w:val="0"/>
+              <w:kern w:val="2"/>
+              <w14:ligatures w14:val="standardContextual"/>
+            </w:rPr>
+          </w:pPr>
+          <w:hyperlink w:anchor="_Toc224912217" w:history="1">
+            <w:r>
+              <w:rPr>
+                <w:rStyle w:val="Hyperlink"/>
+              </w:rPr>
+              <w:t>14.</w:t>
+            </w:r>
+            <w:r>
+              <w:rPr>
+                <w:rFonts w:asciiTheme="minorHAnsi" w:eastAsiaTheme="minorEastAsia" w:hAnsiTheme="minorHAnsi" w:cstheme="minorBidi"/>
+                <w:b w:val="0"/>
+                <w:caps w:val="0"/>
+                <w:kern w:val="2"/>
+                <w14:ligatures w14:val="standardContextual"/>
+              </w:rPr>
+              <w:tab/>
+            </w:r>
+            <w:r>
+              <w:rPr>
+                <w:rStyle w:val="Hyperlink"/>
+              </w:rPr>
+              <w:t>ANÁLISE E PROPOSTAS PARA REDUÇÃO DO CANCELAMENTO</w:t>
+            </w:r>
+            <w:r>
+              <w:rPr>
+                <w:webHidden/>
+              </w:rPr>
+              <w:tab/>
+            </w:r>
+            <w:r>
+              <w:rPr>
+                <w:webHidden/>
+              </w:rPr>
+              <w:fldChar w:fldCharType="begin"/>
+            </w:r>
+            <w:r>
+              <w:rPr>
+                <w:webHidden/>
+              </w:rPr>
+              <w:instrText xml:space="preserve"> PAGEREF _Toc224912217 \h </w:instrText>
+            </w:r>
+            <w:r>
+              <w:rPr>
+                <w:webHidden/>
+              </w:rPr>
+            </w:r>
+            <w:r>
+              <w:rPr>
+                <w:webHidden/>
+              </w:rPr>
+              <w:fldChar w:fldCharType="separate"/>
+            </w:r>
+            <w:r>
+              <w:rPr>
+                <w:webHidden/>
+              </w:rPr>
+              <w:t>13</w:t>
             </w:r>
             <w:r>
               <w:rPr>
@@ -1975,7 +2073,7 @@
           <w:rFonts w:ascii="Arial" w:hAnsi="Arial" w:cs="Arial"/>
         </w:rPr>
       </w:pPr>
-      <w:bookmarkStart w:id="0" w:name="_Toc224323548"/>
+      <w:bookmarkStart w:id="0" w:name="_Toc224912204"/>
       <w:r>
         <w:rPr>
           <w:rFonts w:ascii="Arial" w:hAnsi="Arial" w:cs="Arial"/>
@@ -2092,7 +2190,7 @@
           <w:rFonts w:ascii="Arial" w:hAnsi="Arial" w:cs="Arial"/>
         </w:rPr>
       </w:pPr>
-      <w:bookmarkStart w:id="1" w:name="_Toc224323549"/>
+      <w:bookmarkStart w:id="1" w:name="_Toc224912205"/>
       <w:r>
         <w:rPr>
           <w:rFonts w:ascii="Arial" w:hAnsi="Arial" w:cs="Arial"/>
@@ -2134,17 +2232,35 @@
           <w:rFonts w:ascii="Arial" w:hAnsi="Arial" w:cs="Arial"/>
           <w:i w:val="0"/>
         </w:rPr>
-        <w:t xml:space="preserve">Para o desenvolvimento do modelo de previsão de cancelamento de clientes foi utilizado o dataset </w:t>
-      </w:r>
-      <w:r>
-        <w:rPr>
-          <w:rFonts w:ascii="Arial" w:hAnsi="Arial" w:cs="Arial"/>
-          <w:b/>
-          <w:bCs/>
+        <w:t xml:space="preserve">Para o desenvolvimento do modelo de previsão de cancelamento de clientes foi utilizado o </w:t>
+      </w:r>
+      <w:proofErr w:type="spellStart"/>
+      <w:r>
+        <w:rPr>
+          <w:rFonts w:ascii="Arial" w:hAnsi="Arial" w:cs="Arial"/>
           <w:i w:val="0"/>
         </w:rPr>
+        <w:t>dataset</w:t>
+      </w:r>
+      <w:proofErr w:type="spellEnd"/>
+      <w:r>
+        <w:rPr>
+          <w:rFonts w:ascii="Arial" w:hAnsi="Arial" w:cs="Arial"/>
+          <w:i w:val="0"/>
+        </w:rPr>
+        <w:t xml:space="preserve"> </w:t>
+      </w:r>
+      <w:proofErr w:type="spellStart"/>
+      <w:r>
+        <w:rPr>
+          <w:rFonts w:ascii="Arial" w:hAnsi="Arial" w:cs="Arial"/>
+          <w:b/>
+          <w:bCs/>
+          <w:i w:val="0"/>
+        </w:rPr>
         <w:t>Cancelamento_streaming</w:t>
       </w:r>
+      <w:proofErr w:type="spellEnd"/>
       <w:r>
         <w:rPr>
           <w:rFonts w:ascii="Arial" w:hAnsi="Arial" w:cs="Arial"/>
@@ -2452,7 +2568,21 @@
           <w:rFonts w:ascii="Arial" w:hAnsi="Arial" w:cs="Arial"/>
         </w:rPr>
         <w:lastRenderedPageBreak/>
-        <w:t xml:space="preserve">O dataset foi carregado na ferramenta </w:t>
+        <w:t xml:space="preserve">O </w:t>
+      </w:r>
+      <w:proofErr w:type="spellStart"/>
+      <w:r>
+        <w:rPr>
+          <w:rFonts w:ascii="Arial" w:hAnsi="Arial" w:cs="Arial"/>
+        </w:rPr>
+        <w:t>dataset</w:t>
+      </w:r>
+      <w:proofErr w:type="spellEnd"/>
+      <w:r>
+        <w:rPr>
+          <w:rFonts w:ascii="Arial" w:hAnsi="Arial" w:cs="Arial"/>
+        </w:rPr>
+        <w:t xml:space="preserve"> foi carregado na ferramenta </w:t>
       </w:r>
       <w:r>
         <w:rPr>
@@ -2500,7 +2630,7 @@
           <w:lang w:eastAsia="en-US"/>
         </w:rPr>
       </w:pPr>
-      <w:bookmarkStart w:id="2" w:name="_Toc224323550"/>
+      <w:bookmarkStart w:id="2" w:name="_Toc224912206"/>
       <w:r>
         <w:rPr>
           <w:rFonts w:eastAsia="Calibri"/>
@@ -2545,7 +2675,14 @@
         <w:rPr>
           <w:rFonts w:ascii="Arial" w:hAnsi="Arial" w:cs="Arial"/>
         </w:rPr>
-        <w:t xml:space="preserve"> utilizando o widget </w:t>
+        <w:t xml:space="preserve"> utilizando o </w:t>
+      </w:r>
+      <w:proofErr w:type="gramStart"/>
+      <w:r>
+        <w:rPr>
+          <w:rFonts w:ascii="Arial" w:hAnsi="Arial" w:cs="Arial"/>
+        </w:rPr>
+        <w:t xml:space="preserve">widget </w:t>
       </w:r>
       <w:r>
         <w:rPr>
@@ -2555,6 +2692,7 @@
         </w:rPr>
         <w:t>File</w:t>
       </w:r>
+      <w:proofErr w:type="gramEnd"/>
       <w:r>
         <w:rPr>
           <w:rFonts w:ascii="Arial" w:hAnsi="Arial" w:cs="Arial"/>
@@ -2586,7 +2724,21 @@
         <w:rPr>
           <w:rFonts w:ascii="Arial" w:hAnsi="Arial" w:cs="Arial"/>
         </w:rPr>
-        <w:t xml:space="preserve">Após a importação, o sistema reconheceu a estrutura do dataset, contendo informações sobre clientes e a variável </w:t>
+        <w:t xml:space="preserve">Após a importação, o sistema reconheceu a estrutura do </w:t>
+      </w:r>
+      <w:proofErr w:type="spellStart"/>
+      <w:r>
+        <w:rPr>
+          <w:rFonts w:ascii="Arial" w:hAnsi="Arial" w:cs="Arial"/>
+        </w:rPr>
+        <w:t>dataset</w:t>
+      </w:r>
+      <w:proofErr w:type="spellEnd"/>
+      <w:r>
+        <w:rPr>
+          <w:rFonts w:ascii="Arial" w:hAnsi="Arial" w:cs="Arial"/>
+        </w:rPr>
+        <w:t xml:space="preserve">, contendo informações sobre clientes e a variável </w:t>
       </w:r>
       <w:r>
         <w:rPr>
@@ -2670,7 +2822,7 @@
           <w:numId w:val="24"/>
         </w:numPr>
       </w:pPr>
-      <w:bookmarkStart w:id="3" w:name="_Toc224323551"/>
+      <w:bookmarkStart w:id="3" w:name="_Toc224912207"/>
       <w:r>
         <w:t>Visualização dos dados utilizando o widget Data Table</w:t>
       </w:r>
@@ -2701,40 +2853,70 @@
           <w:sz w:val="24"/>
           <w:szCs w:val="24"/>
         </w:rPr>
-        <w:t xml:space="preserve">Após a importação do dataset, foi utilizado o widget </w:t>
-      </w:r>
-      <w:r>
-        <w:rPr>
-          <w:rFonts w:ascii="Arial" w:hAnsi="Arial" w:cs="Arial"/>
-          <w:b/>
-          <w:bCs/>
+        <w:t xml:space="preserve">Após a importação do </w:t>
+      </w:r>
+      <w:proofErr w:type="spellStart"/>
+      <w:r>
+        <w:rPr>
+          <w:rFonts w:ascii="Arial" w:hAnsi="Arial" w:cs="Arial"/>
           <w:sz w:val="24"/>
           <w:szCs w:val="24"/>
         </w:rPr>
-        <w:t>Data Table</w:t>
-      </w:r>
+        <w:t>dataset</w:t>
+      </w:r>
+      <w:proofErr w:type="spellEnd"/>
       <w:r>
         <w:rPr>
           <w:rFonts w:ascii="Arial" w:hAnsi="Arial" w:cs="Arial"/>
           <w:sz w:val="24"/>
           <w:szCs w:val="24"/>
         </w:rPr>
-        <w:t xml:space="preserve"> para </w:t>
-      </w:r>
-      <w:r>
-        <w:rPr>
-          <w:rFonts w:ascii="Arial" w:hAnsi="Arial" w:cs="Arial"/>
+        <w:t xml:space="preserve">, foi utilizado o widget </w:t>
+      </w:r>
+      <w:r>
+        <w:rPr>
+          <w:rFonts w:ascii="Arial" w:hAnsi="Arial" w:cs="Arial"/>
+          <w:b/>
+          <w:bCs/>
           <w:sz w:val="24"/>
           <w:szCs w:val="24"/>
         </w:rPr>
-        <w:t>v</w:t>
-      </w:r>
-      <w:r>
-        <w:rPr>
-          <w:rFonts w:ascii="Arial" w:hAnsi="Arial" w:cs="Arial"/>
+        <w:t xml:space="preserve">Data </w:t>
+      </w:r>
+      <w:proofErr w:type="spellStart"/>
+      <w:r>
+        <w:rPr>
+          <w:rFonts w:ascii="Arial" w:hAnsi="Arial" w:cs="Arial"/>
+          <w:b/>
+          <w:bCs/>
           <w:sz w:val="24"/>
           <w:szCs w:val="24"/>
         </w:rPr>
+        <w:t>Table</w:t>
+      </w:r>
+      <w:proofErr w:type="spellEnd"/>
+      <w:r>
+        <w:rPr>
+          <w:rFonts w:ascii="Arial" w:hAnsi="Arial" w:cs="Arial"/>
+          <w:sz w:val="24"/>
+          <w:szCs w:val="24"/>
+        </w:rPr>
+        <w:t xml:space="preserve"> para </w:t>
+      </w:r>
+      <w:r>
+        <w:rPr>
+          <w:rFonts w:ascii="Arial" w:hAnsi="Arial" w:cs="Arial"/>
+          <w:sz w:val="24"/>
+          <w:szCs w:val="24"/>
+        </w:rPr>
+        <w:t>v</w:t>
+      </w:r>
+      <w:r>
+        <w:rPr>
+          <w:rFonts w:ascii="Arial" w:hAnsi="Arial" w:cs="Arial"/>
+          <w:sz w:val="24"/>
+          <w:szCs w:val="24"/>
+        </w:rPr>
         <w:t>isualizar os dados carregados. Essa ferramenta permite analisar a estrutura da base de dados, observando as variáveis disponíveis e os registros dos clientes.</w:t>
       </w:r>
     </w:p>
@@ -2755,7 +2937,25 @@
           <w:szCs w:val="24"/>
         </w:rPr>
         <w:lastRenderedPageBreak/>
-        <w:t>A visualização é importante para compreender quais características estão presentes no dataset, como idade, gênero, tipo de plano, meses de assinatura, tempo médio mensal de uso e tipo de pagamento.</w:t>
+        <w:t xml:space="preserve">A visualização é importante para compreender quais características estão presentes no </w:t>
+      </w:r>
+      <w:proofErr w:type="spellStart"/>
+      <w:r>
+        <w:rPr>
+          <w:rFonts w:ascii="Arial" w:hAnsi="Arial" w:cs="Arial"/>
+          <w:sz w:val="24"/>
+          <w:szCs w:val="24"/>
+        </w:rPr>
+        <w:t>dataset</w:t>
+      </w:r>
+      <w:proofErr w:type="spellEnd"/>
+      <w:r>
+        <w:rPr>
+          <w:rFonts w:ascii="Arial" w:hAnsi="Arial" w:cs="Arial"/>
+          <w:sz w:val="24"/>
+          <w:szCs w:val="24"/>
+        </w:rPr>
+        <w:t>, como idade, gênero, tipo de plano, meses de assinatura, tempo médio mensal de uso e tipo de pagamento.</w:t>
       </w:r>
     </w:p>
     <w:p>
@@ -2897,7 +3097,7 @@
           <w:numId w:val="24"/>
         </w:numPr>
       </w:pPr>
-      <w:bookmarkStart w:id="4" w:name="_Toc224323552"/>
+      <w:bookmarkStart w:id="4" w:name="_Toc224912208"/>
       <w:r>
         <w:t>Definição da variável alvo (Target)</w:t>
       </w:r>
@@ -2921,15 +3121,41 @@
       <w:r>
         <w:t xml:space="preserve">Neste passo foi utilizado o widget </w:t>
       </w:r>
-      <w:r>
-        <w:rPr>
-          <w:b/>
-          <w:bCs/>
-        </w:rPr>
-        <w:t>Select Columns</w:t>
-      </w:r>
-      <w:r>
-        <w:t xml:space="preserve"> para organizar as variáveis do dataset. A coluna </w:t>
+      <w:proofErr w:type="spellStart"/>
+      <w:r>
+        <w:rPr>
+          <w:b/>
+          <w:bCs/>
+        </w:rPr>
+        <w:t>Select</w:t>
+      </w:r>
+      <w:proofErr w:type="spellEnd"/>
+      <w:r>
+        <w:rPr>
+          <w:b/>
+          <w:bCs/>
+        </w:rPr>
+        <w:t xml:space="preserve"> </w:t>
+      </w:r>
+      <w:proofErr w:type="spellStart"/>
+      <w:r>
+        <w:rPr>
+          <w:b/>
+          <w:bCs/>
+        </w:rPr>
+        <w:t>Columns</w:t>
+      </w:r>
+      <w:proofErr w:type="spellEnd"/>
+      <w:r>
+        <w:t xml:space="preserve"> para organizar as variáveis do </w:t>
+      </w:r>
+      <w:proofErr w:type="spellStart"/>
+      <w:r>
+        <w:t>dataset</w:t>
+      </w:r>
+      <w:proofErr w:type="spellEnd"/>
+      <w:r>
+        <w:t xml:space="preserve">. A coluna </w:t>
       </w:r>
       <w:r>
         <w:rPr>
@@ -3066,7 +3292,7 @@
           <w:numId w:val="24"/>
         </w:numPr>
       </w:pPr>
-      <w:bookmarkStart w:id="5" w:name="_Toc224323553"/>
+      <w:bookmarkStart w:id="5" w:name="_Toc224912209"/>
       <w:r>
         <w:t>Pré-processamento dos dados</w:t>
       </w:r>
@@ -3098,6 +3324,7 @@
         </w:rPr>
         <w:t xml:space="preserve">Nesta etapa foi utilizado o widget </w:t>
       </w:r>
+      <w:proofErr w:type="spellStart"/>
       <w:r>
         <w:rPr>
           <w:rFonts w:ascii="Arial" w:hAnsi="Arial" w:cs="Arial"/>
@@ -3106,6 +3333,7 @@
         </w:rPr>
         <w:t>Preprocess</w:t>
       </w:r>
+      <w:proofErr w:type="spellEnd"/>
       <w:r>
         <w:rPr>
           <w:rFonts w:ascii="Arial" w:hAnsi="Arial" w:cs="Arial"/>
@@ -3162,14 +3390,52 @@
           <w:rFonts w:ascii="Arial" w:hAnsi="Arial" w:cs="Arial"/>
         </w:rPr>
       </w:pPr>
-      <w:r>
-        <w:rPr>
-          <w:rFonts w:ascii="Arial" w:hAnsi="Arial" w:cs="Arial"/>
-          <w:b/>
-          <w:bCs/>
-        </w:rPr>
-        <w:t>Continuize Discrete Variables</w:t>
-      </w:r>
+      <w:proofErr w:type="spellStart"/>
+      <w:r>
+        <w:rPr>
+          <w:rFonts w:ascii="Arial" w:hAnsi="Arial" w:cs="Arial"/>
+          <w:b/>
+          <w:bCs/>
+        </w:rPr>
+        <w:t>Continuize</w:t>
+      </w:r>
+      <w:proofErr w:type="spellEnd"/>
+      <w:r>
+        <w:rPr>
+          <w:rFonts w:ascii="Arial" w:hAnsi="Arial" w:cs="Arial"/>
+          <w:b/>
+          <w:bCs/>
+        </w:rPr>
+        <w:t xml:space="preserve"> </w:t>
+      </w:r>
+      <w:proofErr w:type="spellStart"/>
+      <w:r>
+        <w:rPr>
+          <w:rFonts w:ascii="Arial" w:hAnsi="Arial" w:cs="Arial"/>
+          <w:b/>
+          <w:bCs/>
+        </w:rPr>
+        <w:t>Discrete</w:t>
+      </w:r>
+      <w:proofErr w:type="spellEnd"/>
+      <w:r>
+        <w:rPr>
+          <w:rFonts w:ascii="Arial" w:hAnsi="Arial" w:cs="Arial"/>
+          <w:b/>
+          <w:bCs/>
+        </w:rPr>
+        <w:t xml:space="preserve"> </w:t>
+      </w:r>
+      <w:proofErr w:type="spellStart"/>
+      <w:r>
+        <w:rPr>
+          <w:rFonts w:ascii="Arial" w:hAnsi="Arial" w:cs="Arial"/>
+          <w:b/>
+          <w:bCs/>
+        </w:rPr>
+        <w:t>Variables</w:t>
+      </w:r>
+      <w:proofErr w:type="spellEnd"/>
       <w:r>
         <w:rPr>
           <w:rFonts w:ascii="Arial" w:hAnsi="Arial" w:cs="Arial"/>
@@ -3252,7 +3518,7 @@
           <w:numId w:val="24"/>
         </w:numPr>
       </w:pPr>
-      <w:bookmarkStart w:id="6" w:name="_Toc224323554"/>
+      <w:bookmarkStart w:id="6" w:name="_Toc224912210"/>
       <w:r>
         <w:t>Criação do modelo Random Forest</w:t>
       </w:r>
@@ -3306,6 +3572,7 @@
         </w:rPr>
         <w:t xml:space="preserve">, pois combina diversas árvores de decisão para gerar uma previsão mais robusta e reduzir problemas de </w:t>
       </w:r>
+      <w:proofErr w:type="spellStart"/>
       <w:r>
         <w:rPr>
           <w:rFonts w:ascii="Arial" w:hAnsi="Arial" w:cs="Arial"/>
@@ -3314,6 +3581,7 @@
         </w:rPr>
         <w:t>overfitting</w:t>
       </w:r>
+      <w:proofErr w:type="spellEnd"/>
       <w:r>
         <w:rPr>
           <w:rFonts w:ascii="Arial" w:hAnsi="Arial" w:cs="Arial"/>
@@ -3332,7 +3600,21 @@
           <w:rFonts w:ascii="Arial" w:hAnsi="Arial" w:cs="Arial"/>
         </w:rPr>
         <w:lastRenderedPageBreak/>
-        <w:t xml:space="preserve">O modelo foi treinado utilizando as variáveis do dataset como </w:t>
+        <w:t xml:space="preserve">O modelo foi treinado utilizando as variáveis do </w:t>
+      </w:r>
+      <w:proofErr w:type="spellStart"/>
+      <w:r>
+        <w:rPr>
+          <w:rFonts w:ascii="Arial" w:hAnsi="Arial" w:cs="Arial"/>
+        </w:rPr>
+        <w:t>dataset</w:t>
+      </w:r>
+      <w:proofErr w:type="spellEnd"/>
+      <w:r>
+        <w:rPr>
+          <w:rFonts w:ascii="Arial" w:hAnsi="Arial" w:cs="Arial"/>
+        </w:rPr>
+        <w:t xml:space="preserve"> como </w:t>
       </w:r>
       <w:r>
         <w:rPr>
@@ -3465,7 +3747,7 @@
           <w:numId w:val="24"/>
         </w:numPr>
       </w:pPr>
-      <w:bookmarkStart w:id="7" w:name="_Toc224323555"/>
+      <w:bookmarkStart w:id="7" w:name="_Toc224912211"/>
       <w:r>
         <w:t>Avaliação do modelo</w:t>
       </w:r>
@@ -3523,7 +3805,25 @@
           <w:b/>
           <w:bCs/>
         </w:rPr>
-        <w:t>validação cruzada (Cross Validation)</w:t>
+        <w:t xml:space="preserve">validação cruzada (Cross </w:t>
+      </w:r>
+      <w:proofErr w:type="spellStart"/>
+      <w:r>
+        <w:rPr>
+          <w:rFonts w:ascii="Arial" w:hAnsi="Arial" w:cs="Arial"/>
+          <w:b/>
+          <w:bCs/>
+        </w:rPr>
+        <w:t>Validation</w:t>
+      </w:r>
+      <w:proofErr w:type="spellEnd"/>
+      <w:r>
+        <w:rPr>
+          <w:rFonts w:ascii="Arial" w:hAnsi="Arial" w:cs="Arial"/>
+          <w:b/>
+          <w:bCs/>
+        </w:rPr>
+        <w:t>)</w:t>
       </w:r>
       <w:r>
         <w:rPr>
@@ -3537,8 +3837,18 @@
           <w:b/>
           <w:bCs/>
         </w:rPr>
-        <w:t>10 folds</w:t>
-      </w:r>
+        <w:t xml:space="preserve">10 </w:t>
+      </w:r>
+      <w:proofErr w:type="spellStart"/>
+      <w:r>
+        <w:rPr>
+          <w:rFonts w:ascii="Arial" w:hAnsi="Arial" w:cs="Arial"/>
+          <w:b/>
+          <w:bCs/>
+        </w:rPr>
+        <w:t>folds</w:t>
+      </w:r>
+      <w:proofErr w:type="spellEnd"/>
       <w:r>
         <w:rPr>
           <w:rFonts w:ascii="Arial" w:hAnsi="Arial" w:cs="Arial"/>
@@ -3606,7 +3916,25 @@
           <w:b/>
           <w:bCs/>
         </w:rPr>
-        <w:t>Precisão (Precision)</w:t>
+        <w:t>Precisão (</w:t>
+      </w:r>
+      <w:proofErr w:type="spellStart"/>
+      <w:r>
+        <w:rPr>
+          <w:rFonts w:ascii="Arial" w:hAnsi="Arial" w:cs="Arial"/>
+          <w:b/>
+          <w:bCs/>
+        </w:rPr>
+        <w:t>Precision</w:t>
+      </w:r>
+      <w:proofErr w:type="spellEnd"/>
+      <w:r>
+        <w:rPr>
+          <w:rFonts w:ascii="Arial" w:hAnsi="Arial" w:cs="Arial"/>
+          <w:b/>
+          <w:bCs/>
+        </w:rPr>
+        <w:t>)</w:t>
       </w:r>
       <w:r>
         <w:rPr>
@@ -3634,7 +3962,25 @@
           <w:b/>
           <w:bCs/>
         </w:rPr>
-        <w:t>Acurácia (Accuracy)</w:t>
+        <w:t>Acurácia (</w:t>
+      </w:r>
+      <w:proofErr w:type="spellStart"/>
+      <w:r>
+        <w:rPr>
+          <w:rFonts w:ascii="Arial" w:hAnsi="Arial" w:cs="Arial"/>
+          <w:b/>
+          <w:bCs/>
+        </w:rPr>
+        <w:t>Accuracy</w:t>
+      </w:r>
+      <w:proofErr w:type="spellEnd"/>
+      <w:r>
+        <w:rPr>
+          <w:rFonts w:ascii="Arial" w:hAnsi="Arial" w:cs="Arial"/>
+          <w:b/>
+          <w:bCs/>
+        </w:rPr>
+        <w:t>)</w:t>
       </w:r>
       <w:r>
         <w:rPr>
@@ -3716,7 +4062,21 @@
         <w:rPr>
           <w:rFonts w:ascii="Arial" w:hAnsi="Arial" w:cs="Arial"/>
         </w:rPr>
-        <w:t>Os resultados obtidos apresentaram valores máximos nas métricas de avaliação (AUC, precisão, recall e acurácia iguais a 1.000). Isso indica que o modelo conseguiu classificar corretamente todos os registros do conjunto de dados. Esse resultado pode ocorrer devido à estrutura simplificada e repetitiva do dataset utilizado, que facilita a identificação de padrões pelo algoritmo.</w:t>
+        <w:t xml:space="preserve">Os resultados obtidos apresentaram valores máximos nas métricas de avaliação (AUC, precisão, recall e acurácia iguais a 1.000). Isso indica que o modelo conseguiu classificar corretamente todos os registros do conjunto de dados. Esse resultado pode ocorrer devido à estrutura simplificada e repetitiva do </w:t>
+      </w:r>
+      <w:proofErr w:type="spellStart"/>
+      <w:r>
+        <w:rPr>
+          <w:rFonts w:ascii="Arial" w:hAnsi="Arial" w:cs="Arial"/>
+        </w:rPr>
+        <w:t>dataset</w:t>
+      </w:r>
+      <w:proofErr w:type="spellEnd"/>
+      <w:r>
+        <w:rPr>
+          <w:rFonts w:ascii="Arial" w:hAnsi="Arial" w:cs="Arial"/>
+        </w:rPr>
+        <w:t xml:space="preserve"> utilizado, que facilita a identificação de padrões pelo algoritmo.</w:t>
       </w:r>
     </w:p>
     <w:p>
@@ -3734,7 +4094,7 @@
           <w:numId w:val="24"/>
         </w:numPr>
       </w:pPr>
-      <w:bookmarkStart w:id="8" w:name="_Toc224323556"/>
+      <w:bookmarkStart w:id="8" w:name="_Toc224912212"/>
       <w:r>
         <w:t>Matriz de Confusão</w:t>
       </w:r>
@@ -3758,19 +4118,43 @@
         </w:rPr>
         <w:t xml:space="preserve">Para analisar o desempenho do modelo foi utilizada a </w:t>
       </w:r>
-      <w:r>
-        <w:rPr>
-          <w:rFonts w:ascii="Arial" w:hAnsi="Arial" w:cs="Arial"/>
-          <w:b/>
-          <w:bCs/>
-        </w:rPr>
-        <w:t>Confusion Matrix</w:t>
-      </w:r>
-      <w:r>
-        <w:rPr>
-          <w:rFonts w:ascii="Arial" w:hAnsi="Arial" w:cs="Arial"/>
-        </w:rPr>
-        <w:t>, que apresenta a comparação entre as previsões realizadas pelo modelo e os valores reais presentes no dataset.</w:t>
+      <w:proofErr w:type="spellStart"/>
+      <w:r>
+        <w:rPr>
+          <w:rFonts w:ascii="Arial" w:hAnsi="Arial" w:cs="Arial"/>
+          <w:b/>
+          <w:bCs/>
+        </w:rPr>
+        <w:t>Confusion</w:t>
+      </w:r>
+      <w:proofErr w:type="spellEnd"/>
+      <w:r>
+        <w:rPr>
+          <w:rFonts w:ascii="Arial" w:hAnsi="Arial" w:cs="Arial"/>
+          <w:b/>
+          <w:bCs/>
+        </w:rPr>
+        <w:t xml:space="preserve"> Matrix</w:t>
+      </w:r>
+      <w:r>
+        <w:rPr>
+          <w:rFonts w:ascii="Arial" w:hAnsi="Arial" w:cs="Arial"/>
+        </w:rPr>
+        <w:t xml:space="preserve">, que apresenta a comparação entre as previsões realizadas pelo modelo e os valores reais presentes no </w:t>
+      </w:r>
+      <w:proofErr w:type="spellStart"/>
+      <w:r>
+        <w:rPr>
+          <w:rFonts w:ascii="Arial" w:hAnsi="Arial" w:cs="Arial"/>
+        </w:rPr>
+        <w:t>dataset</w:t>
+      </w:r>
+      <w:proofErr w:type="spellEnd"/>
+      <w:r>
+        <w:rPr>
+          <w:rFonts w:ascii="Arial" w:hAnsi="Arial" w:cs="Arial"/>
+        </w:rPr>
+        <w:t>.</w:t>
       </w:r>
     </w:p>
     <w:p>
@@ -3931,7 +4315,7 @@
           <w:numId w:val="24"/>
         </w:numPr>
       </w:pPr>
-      <w:bookmarkStart w:id="9" w:name="_Toc224323557"/>
+      <w:bookmarkStart w:id="9" w:name="_Toc224912213"/>
       <w:r>
         <w:t>Análise da Matriz de Confusão</w:t>
       </w:r>
@@ -3955,7 +4339,21 @@
         <w:rPr>
           <w:rFonts w:ascii="Arial" w:hAnsi="Arial" w:cs="Arial"/>
         </w:rPr>
-        <w:t xml:space="preserve">A matriz de confusão apresenta a comparação entre as previsões realizadas pelo modelo e os valores reais presentes no dataset. Essa análise permite verificar quantos </w:t>
+        <w:t xml:space="preserve">A matriz de confusão apresenta a comparação entre as previsões realizadas pelo modelo e os valores reais presentes no </w:t>
+      </w:r>
+      <w:proofErr w:type="spellStart"/>
+      <w:r>
+        <w:rPr>
+          <w:rFonts w:ascii="Arial" w:hAnsi="Arial" w:cs="Arial"/>
+        </w:rPr>
+        <w:t>dataset</w:t>
+      </w:r>
+      <w:proofErr w:type="spellEnd"/>
+      <w:r>
+        <w:rPr>
+          <w:rFonts w:ascii="Arial" w:hAnsi="Arial" w:cs="Arial"/>
+        </w:rPr>
+        <w:t xml:space="preserve">. Essa análise permite verificar quantos </w:t>
       </w:r>
       <w:r>
         <w:rPr>
@@ -4071,7 +4469,21 @@
         <w:rPr>
           <w:rFonts w:ascii="Arial" w:hAnsi="Arial" w:cs="Arial"/>
         </w:rPr>
-        <w:t>, embora seja importante considerar que o dataset utilizado possui estrutura simplificada e repetitiva, o que pode facilitar a identificação de padrões pelo algoritmo.</w:t>
+        <w:t xml:space="preserve">, embora seja importante considerar que o </w:t>
+      </w:r>
+      <w:proofErr w:type="spellStart"/>
+      <w:r>
+        <w:rPr>
+          <w:rFonts w:ascii="Arial" w:hAnsi="Arial" w:cs="Arial"/>
+        </w:rPr>
+        <w:t>dataset</w:t>
+      </w:r>
+      <w:proofErr w:type="spellEnd"/>
+      <w:r>
+        <w:rPr>
+          <w:rFonts w:ascii="Arial" w:hAnsi="Arial" w:cs="Arial"/>
+        </w:rPr>
+        <w:t xml:space="preserve"> utilizado possui estrutura simplificada e repetitiva, o que pode facilitar a identificação de padrões pelo algoritmo.</w:t>
       </w:r>
     </w:p>
     <w:p>
@@ -4089,7 +4501,7 @@
           <w:numId w:val="24"/>
         </w:numPr>
       </w:pPr>
-      <w:bookmarkStart w:id="10" w:name="_Toc224323558"/>
+      <w:bookmarkStart w:id="10" w:name="_Toc224912214"/>
       <w:r>
         <w:t>Curva ROC</w:t>
       </w:r>
@@ -4119,7 +4531,61 @@
           <w:b/>
           <w:bCs/>
         </w:rPr>
-        <w:t>Curva ROC (Receiver Operating Characteristic)</w:t>
+        <w:t>Curva ROC (</w:t>
+      </w:r>
+      <w:proofErr w:type="spellStart"/>
+      <w:r>
+        <w:rPr>
+          <w:rFonts w:ascii="Arial" w:hAnsi="Arial" w:cs="Arial"/>
+          <w:b/>
+          <w:bCs/>
+        </w:rPr>
+        <w:t>Receiver</w:t>
+      </w:r>
+      <w:proofErr w:type="spellEnd"/>
+      <w:r>
+        <w:rPr>
+          <w:rFonts w:ascii="Arial" w:hAnsi="Arial" w:cs="Arial"/>
+          <w:b/>
+          <w:bCs/>
+        </w:rPr>
+        <w:t xml:space="preserve"> </w:t>
+      </w:r>
+      <w:proofErr w:type="spellStart"/>
+      <w:r>
+        <w:rPr>
+          <w:rFonts w:ascii="Arial" w:hAnsi="Arial" w:cs="Arial"/>
+          <w:b/>
+          <w:bCs/>
+        </w:rPr>
+        <w:t>Operating</w:t>
+      </w:r>
+      <w:proofErr w:type="spellEnd"/>
+      <w:r>
+        <w:rPr>
+          <w:rFonts w:ascii="Arial" w:hAnsi="Arial" w:cs="Arial"/>
+          <w:b/>
+          <w:bCs/>
+        </w:rPr>
+        <w:t xml:space="preserve"> </w:t>
+      </w:r>
+      <w:proofErr w:type="spellStart"/>
+      <w:r>
+        <w:rPr>
+          <w:rFonts w:ascii="Arial" w:hAnsi="Arial" w:cs="Arial"/>
+          <w:b/>
+          <w:bCs/>
+        </w:rPr>
+        <w:t>Characteristic</w:t>
+      </w:r>
+      <w:proofErr w:type="spellEnd"/>
+      <w:r>
+        <w:rPr>
+          <w:rFonts w:ascii="Arial" w:hAnsi="Arial" w:cs="Arial"/>
+          <w:b/>
+          <w:bCs/>
+        </w:rPr>
+        <w:t>)</w:t>
       </w:r>
       <w:r>
         <w:rPr>
@@ -4133,7 +4599,25 @@
           <w:b/>
           <w:bCs/>
         </w:rPr>
-        <w:t>taxa de verdadeiros positivos (True Positive Rate)</w:t>
+        <w:t>taxa de verdadeiros positivos (</w:t>
+      </w:r>
+      <w:proofErr w:type="spellStart"/>
+      <w:r>
+        <w:rPr>
+          <w:rFonts w:ascii="Arial" w:hAnsi="Arial" w:cs="Arial"/>
+          <w:b/>
+          <w:bCs/>
+        </w:rPr>
+        <w:t>True</w:t>
+      </w:r>
+      <w:proofErr w:type="spellEnd"/>
+      <w:r>
+        <w:rPr>
+          <w:rFonts w:ascii="Arial" w:hAnsi="Arial" w:cs="Arial"/>
+          <w:b/>
+          <w:bCs/>
+        </w:rPr>
+        <w:t xml:space="preserve"> Positive Rate)</w:t>
       </w:r>
       <w:r>
         <w:rPr>
@@ -4174,7 +4658,43 @@
           <w:b/>
           <w:bCs/>
         </w:rPr>
-        <w:t>área sob a curva (AUC – Area Under the Curve)</w:t>
+        <w:t xml:space="preserve">área sob a curva (AUC – Area </w:t>
+      </w:r>
+      <w:proofErr w:type="spellStart"/>
+      <w:r>
+        <w:rPr>
+          <w:rFonts w:ascii="Arial" w:hAnsi="Arial" w:cs="Arial"/>
+          <w:b/>
+          <w:bCs/>
+        </w:rPr>
+        <w:t>Under</w:t>
+      </w:r>
+      <w:proofErr w:type="spellEnd"/>
+      <w:r>
+        <w:rPr>
+          <w:rFonts w:ascii="Arial" w:hAnsi="Arial" w:cs="Arial"/>
+          <w:b/>
+          <w:bCs/>
+        </w:rPr>
+        <w:t xml:space="preserve"> </w:t>
+      </w:r>
+      <w:proofErr w:type="spellStart"/>
+      <w:r>
+        <w:rPr>
+          <w:rFonts w:ascii="Arial" w:hAnsi="Arial" w:cs="Arial"/>
+          <w:b/>
+          <w:bCs/>
+        </w:rPr>
+        <w:t>the</w:t>
+      </w:r>
+      <w:proofErr w:type="spellEnd"/>
+      <w:r>
+        <w:rPr>
+          <w:rFonts w:ascii="Arial" w:hAnsi="Arial" w:cs="Arial"/>
+          <w:b/>
+          <w:bCs/>
+        </w:rPr>
+        <w:t xml:space="preserve"> Curve)</w:t>
       </w:r>
       <w:r>
         <w:rPr>
@@ -4302,7 +4822,7 @@
           <w:numId w:val="24"/>
         </w:numPr>
       </w:pPr>
-      <w:bookmarkStart w:id="11" w:name="_Toc224323559"/>
+      <w:bookmarkStart w:id="11" w:name="_Toc224912215"/>
       <w:r>
         <w:t>Análise de Importância das Variáveis</w:t>
       </w:r>
@@ -4546,7 +5066,25 @@
           <w:b/>
           <w:bCs/>
         </w:rPr>
-        <w:t>seleção de atributos (Feature Selection)</w:t>
+        <w:t xml:space="preserve">seleção de atributos (Feature </w:t>
+      </w:r>
+      <w:proofErr w:type="spellStart"/>
+      <w:r>
+        <w:rPr>
+          <w:rFonts w:ascii="Arial" w:hAnsi="Arial" w:cs="Arial"/>
+          <w:b/>
+          <w:bCs/>
+        </w:rPr>
+        <w:t>Selection</w:t>
+      </w:r>
+      <w:proofErr w:type="spellEnd"/>
+      <w:r>
+        <w:rPr>
+          <w:rFonts w:ascii="Arial" w:hAnsi="Arial" w:cs="Arial"/>
+          <w:b/>
+          <w:bCs/>
+        </w:rPr>
+        <w:t>)</w:t>
       </w:r>
       <w:r>
         <w:rPr>
@@ -4570,7 +5108,7 @@
           <w:numId w:val="24"/>
         </w:numPr>
       </w:pPr>
-      <w:bookmarkStart w:id="12" w:name="_Toc224323560"/>
+      <w:bookmarkStart w:id="12" w:name="_Toc224912216"/>
       <w:r>
         <w:t>Conclusão</w:t>
       </w:r>
@@ -4828,6 +5366,430 @@
     </w:p>
     <w:p>
       <w:pPr>
+        <w:pStyle w:val="Ttulo1"/>
+        <w:numPr>
+          <w:ilvl w:val="0"/>
+          <w:numId w:val="24"/>
+        </w:numPr>
+      </w:pPr>
+      <w:bookmarkStart w:id="13" w:name="_Toc224912217"/>
+      <w:r>
+        <w:t>ANÁLISE E PROPOSTAS PARA REDUÇÃO DO CANCELAMENTO</w:t>
+      </w:r>
+      <w:bookmarkEnd w:id="13"/>
+    </w:p>
+    <w:p>
+      <w:pPr>
+        <w:rPr>
+          <w:rFonts w:ascii="Arial" w:hAnsi="Arial" w:cs="Arial"/>
+        </w:rPr>
+      </w:pPr>
+    </w:p>
+    <w:p>
+      <w:pPr>
+        <w:numPr>
+          <w:ilvl w:val="0"/>
+          <w:numId w:val="2"/>
+        </w:numPr>
+        <w:tabs>
+          <w:tab w:val="clear" w:pos="720"/>
+        </w:tabs>
+        <w:rPr>
+          <w:rFonts w:ascii="Arial" w:hAnsi="Arial" w:cs="Arial"/>
+          <w:b/>
+          <w:bCs/>
+        </w:rPr>
+      </w:pPr>
+      <w:r>
+        <w:rPr>
+          <w:rFonts w:ascii="Arial" w:hAnsi="Arial" w:cs="Arial"/>
+          <w:b/>
+          <w:bCs/>
+        </w:rPr>
+        <w:t>Quais são os principais fatores que levam ao cancelamento?</w:t>
+      </w:r>
+    </w:p>
+    <w:p>
+      <w:pPr>
+        <w:rPr>
+          <w:rFonts w:ascii="Arial" w:hAnsi="Arial" w:cs="Arial"/>
+        </w:rPr>
+      </w:pPr>
+      <w:r>
+        <w:rPr>
+          <w:rFonts w:ascii="Arial" w:hAnsi="Arial" w:cs="Arial"/>
+        </w:rPr>
+        <w:t xml:space="preserve">Os principais fatores identificados no </w:t>
+      </w:r>
+      <w:proofErr w:type="spellStart"/>
+      <w:r>
+        <w:rPr>
+          <w:rFonts w:ascii="Arial" w:hAnsi="Arial" w:cs="Arial"/>
+        </w:rPr>
+        <w:t>dataset</w:t>
+      </w:r>
+      <w:proofErr w:type="spellEnd"/>
+      <w:r>
+        <w:rPr>
+          <w:rFonts w:ascii="Arial" w:hAnsi="Arial" w:cs="Arial"/>
+        </w:rPr>
+        <w:t xml:space="preserve"> estão relacionados ao baixo tempo de assinatura, menor tempo médio de uso da plataforma e determinados tipos de plano. Clientes com pouco tempo de vínculo tendem a apresentar maior probabilidade de cancelamento.</w:t>
+      </w:r>
+    </w:p>
+    <w:p>
+      <w:pPr>
+        <w:rPr>
+          <w:rFonts w:ascii="Arial" w:hAnsi="Arial" w:cs="Arial"/>
+        </w:rPr>
+      </w:pPr>
+    </w:p>
+    <w:p>
+      <w:pPr>
+        <w:numPr>
+          <w:ilvl w:val="0"/>
+          <w:numId w:val="2"/>
+        </w:numPr>
+        <w:tabs>
+          <w:tab w:val="clear" w:pos="720"/>
+        </w:tabs>
+        <w:rPr>
+          <w:rFonts w:ascii="Arial" w:hAnsi="Arial" w:cs="Arial"/>
+          <w:b/>
+          <w:bCs/>
+        </w:rPr>
+      </w:pPr>
+      <w:r>
+        <w:rPr>
+          <w:rFonts w:ascii="Arial" w:hAnsi="Arial" w:cs="Arial"/>
+          <w:b/>
+          <w:bCs/>
+        </w:rPr>
+        <w:t>Quem são os principais afetados dentro da organização?</w:t>
+      </w:r>
+    </w:p>
+    <w:p>
+      <w:pPr>
+        <w:rPr>
+          <w:rFonts w:ascii="Arial" w:hAnsi="Arial" w:cs="Arial"/>
+        </w:rPr>
+      </w:pPr>
+      <w:r>
+        <w:rPr>
+          <w:rFonts w:ascii="Arial" w:hAnsi="Arial" w:cs="Arial"/>
+        </w:rPr>
+        <w:t>Os principais afetados são os setores de marketing, financeiro e atendimento ao cliente, pois o cancelamento impacta diretamente a receita da empresa e exige ações para retenção de clientes.</w:t>
+      </w:r>
+    </w:p>
+    <w:p>
+      <w:pPr>
+        <w:rPr>
+          <w:rFonts w:ascii="Arial" w:hAnsi="Arial" w:cs="Arial"/>
+        </w:rPr>
+      </w:pPr>
+    </w:p>
+    <w:p>
+      <w:pPr>
+        <w:rPr>
+          <w:rFonts w:ascii="Arial" w:hAnsi="Arial" w:cs="Arial"/>
+        </w:rPr>
+      </w:pPr>
+    </w:p>
+    <w:p>
+      <w:pPr>
+        <w:rPr>
+          <w:rFonts w:ascii="Arial" w:hAnsi="Arial" w:cs="Arial"/>
+        </w:rPr>
+      </w:pPr>
+    </w:p>
+    <w:p>
+      <w:pPr>
+        <w:rPr>
+          <w:rFonts w:ascii="Arial" w:hAnsi="Arial" w:cs="Arial"/>
+        </w:rPr>
+      </w:pPr>
+    </w:p>
+    <w:p>
+      <w:pPr>
+        <w:rPr>
+          <w:rFonts w:ascii="Arial" w:hAnsi="Arial" w:cs="Arial"/>
+        </w:rPr>
+      </w:pPr>
+    </w:p>
+    <w:p>
+      <w:pPr>
+        <w:numPr>
+          <w:ilvl w:val="0"/>
+          <w:numId w:val="2"/>
+        </w:numPr>
+        <w:tabs>
+          <w:tab w:val="clear" w:pos="720"/>
+        </w:tabs>
+        <w:rPr>
+          <w:rFonts w:ascii="Arial" w:hAnsi="Arial" w:cs="Arial"/>
+          <w:b/>
+          <w:bCs/>
+        </w:rPr>
+      </w:pPr>
+      <w:r>
+        <w:rPr>
+          <w:rFonts w:ascii="Arial" w:hAnsi="Arial" w:cs="Arial"/>
+          <w:b/>
+          <w:bCs/>
+        </w:rPr>
+        <w:lastRenderedPageBreak/>
+        <w:t>Quais são as possíveis soluções (com prós e contras)?</w:t>
+      </w:r>
+    </w:p>
+    <w:p>
+      <w:pPr>
+        <w:rPr>
+          <w:rFonts w:ascii="Arial" w:hAnsi="Arial" w:cs="Arial"/>
+          <w:b/>
+          <w:bCs/>
+        </w:rPr>
+      </w:pPr>
+    </w:p>
+    <w:p>
+      <w:pPr>
+        <w:rPr>
+          <w:rFonts w:ascii="Arial" w:hAnsi="Arial" w:cs="Arial"/>
+          <w:b/>
+          <w:bCs/>
+        </w:rPr>
+      </w:pPr>
+      <w:r>
+        <w:rPr>
+          <w:rFonts w:ascii="Arial" w:hAnsi="Arial" w:cs="Arial"/>
+          <w:b/>
+          <w:bCs/>
+        </w:rPr>
+        <w:t>Uma possível solução é oferecer promoções para novos clientes.</w:t>
+      </w:r>
+    </w:p>
+    <w:p>
+      <w:pPr>
+        <w:rPr>
+          <w:rFonts w:ascii="Arial" w:hAnsi="Arial" w:cs="Arial"/>
+        </w:rPr>
+      </w:pPr>
+      <w:r>
+        <w:rPr>
+          <w:rFonts w:ascii="Arial" w:hAnsi="Arial" w:cs="Arial"/>
+        </w:rPr>
+        <w:t>Prós: aumenta retenção inicial</w:t>
+      </w:r>
+    </w:p>
+    <w:p>
+      <w:pPr>
+        <w:rPr>
+          <w:rFonts w:ascii="Arial" w:hAnsi="Arial" w:cs="Arial"/>
+        </w:rPr>
+      </w:pPr>
+      <w:r>
+        <w:rPr>
+          <w:rFonts w:ascii="Arial" w:hAnsi="Arial" w:cs="Arial"/>
+        </w:rPr>
+        <w:t>Contras: reduz margem de lucro</w:t>
+      </w:r>
+    </w:p>
+    <w:p>
+      <w:pPr>
+        <w:rPr>
+          <w:rFonts w:ascii="Arial" w:hAnsi="Arial" w:cs="Arial"/>
+        </w:rPr>
+      </w:pPr>
+    </w:p>
+    <w:p>
+      <w:pPr>
+        <w:rPr>
+          <w:rFonts w:ascii="Arial" w:hAnsi="Arial" w:cs="Arial"/>
+          <w:b/>
+          <w:bCs/>
+        </w:rPr>
+      </w:pPr>
+      <w:r>
+        <w:rPr>
+          <w:rFonts w:ascii="Arial" w:hAnsi="Arial" w:cs="Arial"/>
+          <w:b/>
+          <w:bCs/>
+        </w:rPr>
+        <w:t>Outra solução é melhorar a experiência do usuário.</w:t>
+      </w:r>
+    </w:p>
+    <w:p>
+      <w:pPr>
+        <w:rPr>
+          <w:rFonts w:ascii="Arial" w:hAnsi="Arial" w:cs="Arial"/>
+        </w:rPr>
+      </w:pPr>
+      <w:r>
+        <w:rPr>
+          <w:rFonts w:ascii="Arial" w:hAnsi="Arial" w:cs="Arial"/>
+        </w:rPr>
+        <w:t>Prós: aumenta satisfação</w:t>
+      </w:r>
+    </w:p>
+    <w:p>
+      <w:pPr>
+        <w:rPr>
+          <w:rFonts w:ascii="Arial" w:hAnsi="Arial" w:cs="Arial"/>
+        </w:rPr>
+      </w:pPr>
+      <w:r>
+        <w:rPr>
+          <w:rFonts w:ascii="Arial" w:hAnsi="Arial" w:cs="Arial"/>
+        </w:rPr>
+        <w:t>Contras: exige investimento</w:t>
+      </w:r>
+    </w:p>
+    <w:p>
+      <w:pPr>
+        <w:rPr>
+          <w:rFonts w:ascii="Arial" w:hAnsi="Arial" w:cs="Arial"/>
+        </w:rPr>
+      </w:pPr>
+    </w:p>
+    <w:p>
+      <w:pPr>
+        <w:numPr>
+          <w:ilvl w:val="0"/>
+          <w:numId w:val="2"/>
+        </w:numPr>
+        <w:tabs>
+          <w:tab w:val="clear" w:pos="720"/>
+        </w:tabs>
+        <w:rPr>
+          <w:rFonts w:ascii="Arial" w:hAnsi="Arial" w:cs="Arial"/>
+          <w:b/>
+          <w:bCs/>
+        </w:rPr>
+      </w:pPr>
+      <w:r>
+        <w:rPr>
+          <w:rFonts w:ascii="Arial" w:hAnsi="Arial" w:cs="Arial"/>
+          <w:b/>
+          <w:bCs/>
+        </w:rPr>
+        <w:t>Como o modelo preditivo ajuda?</w:t>
+      </w:r>
+    </w:p>
+    <w:p>
+      <w:pPr>
+        <w:rPr>
+          <w:rFonts w:ascii="Arial" w:hAnsi="Arial" w:cs="Arial"/>
+        </w:rPr>
+      </w:pPr>
+      <w:r>
+        <w:rPr>
+          <w:rFonts w:ascii="Arial" w:hAnsi="Arial" w:cs="Arial"/>
+        </w:rPr>
+        <w:t>O modelo permite identificar clientes com maior risco de cancelamento, possibilitando ações preventivas, como ofertas personalizadas e campanhas de retenção.</w:t>
+      </w:r>
+    </w:p>
+    <w:p>
+      <w:pPr>
+        <w:rPr>
+          <w:rFonts w:ascii="Arial" w:hAnsi="Arial" w:cs="Arial"/>
+        </w:rPr>
+      </w:pPr>
+    </w:p>
+    <w:p>
+      <w:pPr>
+        <w:numPr>
+          <w:ilvl w:val="0"/>
+          <w:numId w:val="2"/>
+        </w:numPr>
+        <w:tabs>
+          <w:tab w:val="clear" w:pos="720"/>
+        </w:tabs>
+        <w:rPr>
+          <w:rFonts w:ascii="Arial" w:hAnsi="Arial" w:cs="Arial"/>
+          <w:b/>
+          <w:bCs/>
+        </w:rPr>
+      </w:pPr>
+      <w:r>
+        <w:rPr>
+          <w:rFonts w:ascii="Arial" w:hAnsi="Arial" w:cs="Arial"/>
+          <w:b/>
+          <w:bCs/>
+        </w:rPr>
+        <w:t>Quais os desafios na coleta e análise dos dados?</w:t>
+      </w:r>
+    </w:p>
+    <w:p>
+      <w:pPr>
+        <w:rPr>
+          <w:rFonts w:ascii="Arial" w:hAnsi="Arial" w:cs="Arial"/>
+        </w:rPr>
+      </w:pPr>
+      <w:r>
+        <w:rPr>
+          <w:rFonts w:ascii="Arial" w:hAnsi="Arial" w:cs="Arial"/>
+        </w:rPr>
+        <w:t>Os principais desafios incluem qualidade dos dados, ausência de informações completas e necessidade de tratamento adequado antes da modelagem.</w:t>
+      </w:r>
+    </w:p>
+    <w:p>
+      <w:pPr>
+        <w:rPr>
+          <w:rFonts w:ascii="Arial" w:hAnsi="Arial" w:cs="Arial"/>
+        </w:rPr>
+      </w:pPr>
+    </w:p>
+    <w:p>
+      <w:pPr>
+        <w:numPr>
+          <w:ilvl w:val="0"/>
+          <w:numId w:val="2"/>
+        </w:numPr>
+        <w:tabs>
+          <w:tab w:val="clear" w:pos="720"/>
+        </w:tabs>
+        <w:rPr>
+          <w:rFonts w:ascii="Arial" w:hAnsi="Arial" w:cs="Arial"/>
+          <w:b/>
+          <w:bCs/>
+        </w:rPr>
+      </w:pPr>
+      <w:r>
+        <w:rPr>
+          <w:rFonts w:ascii="Arial" w:hAnsi="Arial" w:cs="Arial"/>
+          <w:b/>
+          <w:bCs/>
+        </w:rPr>
+        <w:t>Relação com classificação e validação</w:t>
+      </w:r>
+    </w:p>
+    <w:p>
+      <w:pPr>
+        <w:rPr>
+          <w:rFonts w:ascii="Arial" w:hAnsi="Arial" w:cs="Arial"/>
+        </w:rPr>
+      </w:pPr>
+      <w:r>
+        <w:rPr>
+          <w:rFonts w:ascii="Arial" w:hAnsi="Arial" w:cs="Arial"/>
+        </w:rPr>
+        <w:t>O problema é um caso de classificação, pois o objetivo é prever se o cliente irá cancelar ou não. A validação foi realizada por meio de validação cruzada, garantindo que o modelo generalize bem para novos dados.</w:t>
+      </w:r>
+    </w:p>
+    <w:p>
+      <w:pPr>
+        <w:rPr>
+          <w:rFonts w:ascii="Arial" w:hAnsi="Arial" w:cs="Arial"/>
+        </w:rPr>
+      </w:pPr>
+    </w:p>
+    <w:p>
+      <w:pPr>
+        <w:rPr>
+          <w:rFonts w:ascii="Arial" w:hAnsi="Arial" w:cs="Arial"/>
+        </w:rPr>
+      </w:pPr>
+    </w:p>
+    <w:p>
+      <w:pPr>
         <w:rPr>
           <w:rFonts w:ascii="Arial" w:hAnsi="Arial" w:cs="Arial"/>
         </w:rPr>
@@ -4851,11 +5813,36 @@
         </w:rPr>
         <w:t xml:space="preserve"> </w:t>
       </w:r>
-      <w:r>
-        <w:rPr>
-          <w:rFonts w:ascii="Arial" w:hAnsi="Arial" w:cs="Arial"/>
-        </w:rPr>
-        <w:t>https://youtu.be/jcNX0-WhQw0</w:t>
+      <w:hyperlink r:id="rId23" w:history="1">
+        <w:r>
+          <w:rPr>
+            <w:rStyle w:val="Hyperlink"/>
+            <w:rFonts w:ascii="Arial" w:hAnsi="Arial" w:cs="Arial"/>
+          </w:rPr>
+          <w:t>https://youtu.be/jcNX0-WhQw0</w:t>
+        </w:r>
+      </w:hyperlink>
+    </w:p>
+    <w:p>
+      <w:pPr>
+        <w:rPr>
+          <w:rFonts w:ascii="Arial" w:hAnsi="Arial" w:cs="Arial"/>
+        </w:rPr>
+      </w:pPr>
+    </w:p>
+    <w:p>
+      <w:pPr>
+        <w:rPr>
+          <w:rFonts w:ascii="Arial" w:hAnsi="Arial" w:cs="Arial"/>
+          <w:lang w:val="en-US"/>
+        </w:rPr>
+      </w:pPr>
+      <w:r>
+        <w:rPr>
+          <w:rFonts w:ascii="Arial" w:hAnsi="Arial" w:cs="Arial"/>
+          <w:lang w:val="en-US"/>
+        </w:rPr>
+        <w:t>LINK GITHUB: https://github.com/crozbrow/churn-streaming-orange</w:t>
       </w:r>
     </w:p>
     <w:p>
@@ -4863,12 +5850,13 @@
         <w:jc w:val="center"/>
         <w:rPr>
           <w:rFonts w:ascii="Arial" w:hAnsi="Arial" w:cs="Arial"/>
+          <w:lang w:val="en-US"/>
         </w:rPr>
       </w:pPr>
     </w:p>
     <w:sectPr>
-      <w:headerReference w:type="default" r:id="rId23"/>
-      <w:footerReference w:type="default" r:id="rId24"/>
+      <w:headerReference w:type="default" r:id="rId24"/>
+      <w:footerReference w:type="default" r:id="rId25"/>
       <w:pgSz w:w="11906" w:h="16838"/>
       <w:pgMar w:top="1701" w:right="1134" w:bottom="1134" w:left="1701" w:header="709" w:footer="709" w:gutter="0"/>
       <w:pgNumType w:start="1"/>
@@ -6082,7 +7070,7 @@
   <w:abstractNum w:abstractNumId="10" w15:restartNumberingAfterBreak="0">
     <w:nsid w:val="4C481BBC"/>
     <w:multiLevelType w:val="hybridMultilevel"/>
-    <w:tmpl w:val="6D34C460"/>
+    <w:tmpl w:val="FEB2A694"/>
     <w:lvl w:ilvl="0" w:tplc="0416000F">
       <w:start w:val="1"/>
       <w:numFmt w:val="decimal"/>

</xml_diff>